<commit_message>
fix: close DOCX font and heading style resources
</commit_message>
<xml_diff>
--- a/projects/2026-summer-assignment/solutions/problem-c-pv-diagnostics/paper.docx
+++ b/projects/2026-summer-assignment/solutions/problem-c-pv-diagnostics/paper.docx
@@ -11622,10 +11622,11 @@
   <w:docDefaults>
     <w:rPrDefault>
       <w:rPr>
-        <w:rFonts w:asciiTheme="minorHAnsi" w:cstheme="minorBidi" w:eastAsiaTheme="minorEastAsia" w:hAnsiTheme="minorHAnsi"/>
+        <w:rFonts w:cstheme="minorBidi" w:ascii="Times New Roman" w:hAnsi="Times New Roman" w:eastAsia="宋体" w:cs="Times New Roman"/>
         <w:sz w:val="24"/>
         <w:szCs w:val="24"/>
         <w:lang w:bidi="ar-SA" w:eastAsia="zh-CN" w:val="en-US"/>
+        <w:color w:val="000000"/>
       </w:rPr>
     </w:rPrDefault>
     <w:pPrDefault>
@@ -11642,8 +11643,9 @@
       <w:spacing w:before="0" w:after="0" w:line="360" w:lineRule="auto"/>
     </w:pPr>
     <w:rPr>
-      <w:rFonts w:ascii="Times New Roman" w:hAnsi="Times New Roman" w:eastAsia="宋体"/>
+      <w:rFonts w:ascii="Times New Roman" w:hAnsi="Times New Roman" w:eastAsia="宋体" w:cs="Times New Roman"/>
       <w:sz w:val="24"/>
+      <w:color w:val="000000"/>
     </w:rPr>
   </w:style>
   <w:style w:styleId="BodyText" w:type="paragraph">
@@ -11698,9 +11700,10 @@
       <w:jc w:val="center"/>
     </w:pPr>
     <w:rPr>
-      <w:rFonts w:asciiTheme="majorHAnsi" w:cstheme="majorBidi" w:eastAsiaTheme="majorEastAsia" w:hAnsiTheme="majorHAnsi"/>
+      <w:rFonts w:cstheme="majorBidi" w:ascii="Times New Roman" w:hAnsi="Times New Roman" w:eastAsia="宋体" w:cs="Times New Roman"/>
       <w:sz w:val="56"/>
       <w:szCs w:val="56"/>
+      <w:color w:val="000000"/>
     </w:rPr>
   </w:style>
   <w:style w:customStyle="1" w:styleId="TitleChar" w:type="character">
@@ -11832,8 +11835,8 @@
       <w:outlineLvl w:val="0"/>
     </w:pPr>
     <w:rPr>
-      <w:rFonts w:asciiTheme="majorHAnsi" w:cstheme="majorBidi" w:eastAsiaTheme="majorEastAsia" w:hAnsiTheme="majorHAnsi"/>
-      <w:color w:themeColor="accent1" w:themeShade="BF" w:val="0F4761"/>
+      <w:rFonts w:cstheme="majorBidi" w:ascii="Times New Roman" w:hAnsi="Times New Roman" w:eastAsia="黑体" w:cs="Times New Roman"/>
+      <w:color w:val="000000"/>
       <w:sz w:val="40"/>
       <w:szCs w:val="40"/>
     </w:rPr>
@@ -11855,8 +11858,8 @@
       <w:outlineLvl w:val="1"/>
     </w:pPr>
     <w:rPr>
-      <w:rFonts w:asciiTheme="majorHAnsi" w:cstheme="majorBidi" w:eastAsiaTheme="majorEastAsia" w:hAnsiTheme="majorHAnsi"/>
-      <w:color w:themeColor="accent1" w:themeShade="BF" w:val="0F4761"/>
+      <w:rFonts w:cstheme="majorBidi" w:ascii="Times New Roman" w:hAnsi="Times New Roman" w:eastAsia="黑体" w:cs="Times New Roman"/>
+      <w:color w:val="000000"/>
       <w:sz w:val="32"/>
       <w:szCs w:val="32"/>
     </w:rPr>
@@ -11878,8 +11881,8 @@
       <w:outlineLvl w:val="2"/>
     </w:pPr>
     <w:rPr>
-      <w:rFonts w:cstheme="majorBidi" w:eastAsiaTheme="majorEastAsia"/>
-      <w:color w:themeColor="accent1" w:themeShade="BF" w:val="0F4761"/>
+      <w:rFonts w:cstheme="majorBidi" w:ascii="Times New Roman" w:hAnsi="Times New Roman" w:eastAsia="宋体" w:cs="Times New Roman"/>
+      <w:color w:val="000000"/>
       <w:sz w:val="28"/>
       <w:szCs w:val="28"/>
     </w:rPr>
@@ -11901,10 +11904,10 @@
       <w:outlineLvl w:val="3"/>
     </w:pPr>
     <w:rPr>
-      <w:rFonts w:cstheme="majorBidi" w:eastAsiaTheme="majorEastAsia"/>
+      <w:rFonts w:cstheme="majorBidi" w:ascii="Times New Roman" w:hAnsi="Times New Roman" w:eastAsia="宋体" w:cs="Times New Roman"/>
       <w:i/>
       <w:iCs/>
-      <w:color w:themeColor="accent1" w:themeShade="BF" w:val="0F4761"/>
+      <w:color w:val="000000"/>
     </w:rPr>
   </w:style>
   <w:style w:styleId="Heading5" w:type="paragraph">
@@ -12575,9 +12578,9 @@
     </a:clrScheme>
     <a:fontScheme name="Office">
       <a:majorFont>
-        <a:latin typeface="Aptos Display" panose="02110004020202020204"/>
-        <a:ea typeface=""/>
-        <a:cs typeface=""/>
+        <a:latin typeface="Times New Roman" panose="02110004020202020204"/>
+        <a:ea typeface="宋体"/>
+        <a:cs typeface="Times New Roman"/>
         <a:font script="Jpan" typeface="游ゴシック Light"/>
         <a:font script="Hang" typeface="맑은 고딕"/>
         <a:font script="Hans" typeface="等线 Light"/>
@@ -12627,9 +12630,9 @@
         <a:font script="Tfng" typeface="Ebrima"/>
       </a:majorFont>
       <a:minorFont>
-        <a:latin typeface="Aptos" panose="02110004020202020204"/>
-        <a:ea typeface=""/>
-        <a:cs typeface=""/>
+        <a:latin typeface="Times New Roman" panose="02110004020202020204"/>
+        <a:ea typeface="宋体"/>
+        <a:cs typeface="Times New Roman"/>
         <a:font script="Jpan" typeface="游明朝"/>
         <a:font script="Hang" typeface="맑은 고딕"/>
         <a:font script="Hans" typeface="等线"/>

</xml_diff>

<commit_message>
Regenerate problem C paper DOCX
</commit_message>
<xml_diff>
--- a/projects/2026-summer-assignment/solutions/problem-c-pv-diagnostics/paper.docx
+++ b/projects/2026-summer-assignment/solutions/problem-c-pv-diagnostics/paper.docx
@@ -335,6 +335,54 @@
         <w:t xml:space="preserve">在最多修复10块组件的预算约束下，按可恢复发电量确定优先维修名单，并估算历史口径下的增发量以及第16日条件下的补充增发量。</w:t>
       </w:r>
     </w:p>
+    <w:p>
+      <w:pPr>
+        <w:pStyle w:val="FirstParagraph"/>
+        <w:snapToGrid w:val="0"/>
+        <w:spacing w:line="360" w:lineRule="auto" w:before="0" w:after="0"/>
+        <w:ind w:firstLine="480"/>
+        <w:jc w:val="both"/>
+      </w:pPr>
+      <w:r>
+        <w:rPr>
+          <w:rFonts w:hint="eastAsia" w:ascii="Times New Roman" w:hAnsi="Times New Roman" w:eastAsia="宋体"/>
+          <w:color w:val="000000"/>
+          <w:sz w:val="24"/>
+        </w:rPr>
+        <w:t xml:space="preserve">从数据结构看，100块组件、15个日期的发电量构成一个</w:t>
+      </w:r>
+      <m:oMath>
+        <m:r>
+          <w:rPr>
+            <w:rFonts w:ascii="Cambria Math" w:hAnsi="Cambria Math" w:eastAsia="Cambria Math" w:cs="Cambria Math"/>
+          </w:rPr>
+          <m:t>100</m:t>
+        </m:r>
+        <m:r>
+          <m:rPr>
+            <m:sty m:val="p"/>
+          </m:rPr>
+          <w:rPr>
+            <w:rFonts w:ascii="Cambria Math" w:hAnsi="Cambria Math" w:eastAsia="Cambria Math" w:cs="Cambria Math"/>
+          </w:rPr>
+          <m:t>×</m:t>
+        </m:r>
+        <m:r>
+          <w:rPr>
+            <w:rFonts w:ascii="Cambria Math" w:hAnsi="Cambria Math" w:eastAsia="Cambria Math" w:cs="Cambria Math"/>
+          </w:rPr>
+          <m:t>15</m:t>
+        </m:r>
+      </m:oMath>
+      <w:r>
+        <w:rPr>
+          <w:rFonts w:hint="eastAsia" w:ascii="Times New Roman" w:hAnsi="Times New Roman" w:eastAsia="宋体"/>
+          <w:color w:val="000000"/>
+          <w:sz w:val="24"/>
+        </w:rPr>
+        <w:t xml:space="preserve">矩阵：沿日期方向对每一行汇总，得到组件层面的历史平均输出，并与题目给定的偏差率共同服务于诊断和维修收益计算；沿组件方向对每一列求和，得到15个站级日总量，与15组逐日气象条件一一对应。组串、方位角、倾角和投运年限是组件的静态属性，只能解释样本中的空间构成，不能增加任务二的独立天气样本数。三个任务实际上是对同一数据矩阵作不同方向的汇总，而不是把所有观测不加区分地送入同一个模型。</w:t>
+      </w:r>
+    </w:p>
     <w:bookmarkEnd w:id="10"/>
     <w:bookmarkStart w:id="11" w:name="任务之间的关系"/>
     <w:p>
@@ -396,6 +444,23 @@
           <w:sz w:val="24"/>
         </w:rPr>
         <w:t xml:space="preserve">三个任务采用不同建模层级，是由题目给出的信息粒度和所问对象共同决定的。任务一的判别指标与阈值均已给定，核心是把组件级偏差映射为状态并补充时间波动筛查，若再训练分类器反而会把参考示例误当标签并改变题意；任务二所问的是全站某一天的总量，而气象条件每天只有一组，因此应在站级、日尺度上建立少参数预测模型；任务三的预算单位相同，且现有数据只能支持组件收益独立相加，于是决策可归结为在故障集合中选择绝对可恢复电量最大的10块，而不是另设复杂组合优化。这个层级安排分别对应“规则判别—站级预测—有限名额决策”，也避免让数据不能识别的复杂度进入模型。</w:t>
+      </w:r>
+    </w:p>
+    <w:p>
+      <w:pPr>
+        <w:pStyle w:val="BodyText"/>
+        <w:snapToGrid w:val="0"/>
+        <w:spacing w:line="360" w:lineRule="auto" w:before="0" w:after="0"/>
+        <w:ind w:firstLine="480"/>
+        <w:jc w:val="both"/>
+      </w:pPr>
+      <w:r>
+        <w:rPr>
+          <w:rFonts w:hint="eastAsia" w:ascii="Times New Roman" w:hAnsi="Times New Roman" w:eastAsia="宋体"/>
+          <w:color w:val="000000"/>
+          <w:sz w:val="24"/>
+        </w:rPr>
+        <w:t xml:space="preserve">三项任务各自面对的核心矛盾也不同。任务一要区分“题目已经定义的平均状态”与“每日曲线可能暴露的暂态干扰”；任务二要在气象机理较丰富与独立日样本仅15个之间控制模型复杂度；任务三则要把相对偏差所表示的受损程度，转化为有限维修名额真正关心的绝对增发收益。前一任务的输出只在语义相符时传给后一任务：任务一传递故障候选集，任务二传递第16日站级天气尺度，而任务三的历史主排序不被第16日单日条件重新定义。</w:t>
       </w:r>
     </w:p>
     <w:p>
@@ -2773,6 +2838,51 @@
           <w:color w:val="000000"/>
           <w:sz w:val="24"/>
         </w:rPr>
+        <w:t xml:space="preserve">这里的</w:t>
+      </w:r>
+      <m:oMath>
+        <m:sSub>
+          <m:e>
+            <m:r>
+              <w:rPr>
+                <w:rFonts w:ascii="Cambria Math" w:hAnsi="Cambria Math" w:eastAsia="Cambria Math" w:cs="Cambria Math"/>
+              </w:rPr>
+              <m:t>b</m:t>
+            </m:r>
+          </m:e>
+          <m:sub>
+            <m:r>
+              <w:rPr>
+                <w:rFonts w:ascii="Cambria Math" w:hAnsi="Cambria Math" w:eastAsia="Cambria Math" w:cs="Cambria Math"/>
+              </w:rPr>
+              <m:t>i</m:t>
+            </m:r>
+          </m:sub>
+        </m:sSub>
+      </m:oMath>
+      <w:r>
+        <w:rPr>
+          <w:rFonts w:hint="eastAsia" w:ascii="Times New Roman" w:hAnsi="Times New Roman" w:eastAsia="宋体"/>
+          <w:color w:val="000000"/>
+          <w:sz w:val="24"/>
+        </w:rPr>
+        <w:t xml:space="preserve">已经是组件在统一15日口径下相对正常基准的汇总指标，阈值又直接规定了该指标与三种状态的对应关系，所以主诊断所需的信息已经闭合。每日发电量能够说明偏差是持续存在还是由少数日期驱动，却不能在缺少新的物理检测标签时重新定义隐裂和热斑。因而，直接应用式（1）并非省略建模，而是把题目给定的诊断规则作为确定性模型；另行拟合分类器会回答“如何从其他变量预测参考标签”这一不同问题。</w:t>
+      </w:r>
+    </w:p>
+    <w:p>
+      <w:pPr>
+        <w:pStyle w:val="BodyText"/>
+        <w:snapToGrid w:val="0"/>
+        <w:spacing w:line="360" w:lineRule="auto" w:before="0" w:after="0"/>
+        <w:ind w:firstLine="480"/>
+        <w:jc w:val="both"/>
+      </w:pPr>
+      <w:r>
+        <w:rPr>
+          <w:rFonts w:hint="eastAsia" w:ascii="Times New Roman" w:hAnsi="Times New Roman" w:eastAsia="宋体"/>
+          <w:color w:val="000000"/>
+          <w:sz w:val="24"/>
+        </w:rPr>
         <w:t xml:space="preserve">题目没有定义</w:t>
       </w:r>
       <m:oMath>
@@ -3295,6 +3405,23 @@
         <w:t xml:space="preserve">的时间离散程度：只有当离散度超过正常同伴基线的稳健阈值，且至少两天出现同向或相邻异常时，才满足一种参照体系下的疑似遮挡条件。为降低同伴选择的影响，分别使用同配置正常同伴和全部正常组件两种参照；两者均标记时记为“疑似遮挡”，结果不一致时记为“筛查不稳定”，均未标记时记为“未发现疑似遮挡”。该筛查只提供现场复核优先级，不改变式（1）的类别。</w:t>
       </w:r>
     </w:p>
+    <w:p>
+      <w:pPr>
+        <w:pStyle w:val="BodyText"/>
+        <w:snapToGrid w:val="0"/>
+        <w:spacing w:line="360" w:lineRule="auto" w:before="0" w:after="0"/>
+        <w:ind w:firstLine="480"/>
+        <w:jc w:val="both"/>
+      </w:pPr>
+      <w:r>
+        <w:rPr>
+          <w:rFonts w:hint="eastAsia" w:ascii="Times New Roman" w:hAnsi="Times New Roman" w:eastAsia="宋体"/>
+          <w:color w:val="000000"/>
+          <w:sz w:val="24"/>
+        </w:rPr>
+        <w:t xml:space="preserve">因此，式（1）、分布统计和遮挡筛查回答的是三个不同问题：式（1）回答“按题目口径该组件属于哪一类”，分布统计回答“这些类别在当前电站的哪些位置或属性组中较集中”，遮挡筛查回答“该组件的日际变化是否提示主诊断可能混入暂态干扰”。三者分别对应状态判定、空间描述和复核提示，不能相互替代。</w:t>
+      </w:r>
+    </w:p>
     <w:bookmarkEnd w:id="17"/>
     <w:bookmarkStart w:id="21" w:name="诊断结果与分布"/>
     <w:p>
@@ -4413,6 +4540,23 @@
         </w:tc>
       </w:tr>
     </w:tbl>
+    <w:p>
+      <w:pPr>
+        <w:pStyle w:val="BodyText"/>
+        <w:snapToGrid w:val="0"/>
+        <w:spacing w:line="360" w:lineRule="auto" w:before="0" w:after="0"/>
+        <w:ind w:firstLine="480"/>
+        <w:jc w:val="both"/>
+      </w:pPr>
+      <w:r>
+        <w:rPr>
+          <w:rFonts w:hint="eastAsia" w:ascii="Times New Roman" w:hAnsi="Times New Roman" w:eastAsia="宋体"/>
+          <w:color w:val="000000"/>
+          <w:sz w:val="24"/>
+        </w:rPr>
+        <w:t xml:space="preserve">30块故障组件构成任务三的维修候选池，70块正常组件则同时为遮挡筛查提供稳定参照。参考示例一致率为100%说明阈值边界、单位换算和分类实现与题目示例相符，但参考示例并非独立测试集，因此该数值不能解释为对未知组件具有100%的预测准确率。</w:t>
+      </w:r>
+    </w:p>
     <w:p>
       <w:pPr>
         <w:pStyle w:val="BodyText"/>
@@ -4537,6 +4681,23 @@
           <w:sz w:val="24"/>
         </w:rPr>
         <w:t xml:space="preserve">遮挡状态与正式类别的交叉结果见表3。3块“疑似遮挡”组件全部同时属于热斑类别，但这只能说明筛查提示与主分类在本数据中的交集，不能据此断言遮挡造成了热斑。另有12块组件在两种参照体系下结论不一致，其中正常、隐裂和热斑分别有2、4和6块，说明辅助筛查应当作为现场检查提示，而不是替代偏差率诊断。</w:t>
+      </w:r>
+    </w:p>
+    <w:p>
+      <w:pPr>
+        <w:pStyle w:val="BodyText"/>
+        <w:snapToGrid w:val="0"/>
+        <w:spacing w:line="360" w:lineRule="auto" w:before="0" w:after="0"/>
+        <w:ind w:firstLine="480"/>
+        <w:jc w:val="both"/>
+      </w:pPr>
+      <w:r>
+        <w:rPr>
+          <w:rFonts w:hint="eastAsia" w:ascii="Times New Roman" w:hAnsi="Times New Roman" w:eastAsia="宋体"/>
+          <w:color w:val="000000"/>
+          <w:sz w:val="24"/>
+        </w:rPr>
+        <w:t xml:space="preserve">在现场处置上，3块被两种参照同时标记的组件适合优先排查局部遮挡、污染或测量异常，以免把可消除的外部干扰直接当作组件本体故障；12块“筛查不稳定”则表示判断会随参照群体改变，需要结合实际安装环境复核，而不是已经确认存在12处遮挡。</w:t>
       </w:r>
     </w:p>
     <w:p>
@@ -6486,6 +6647,23 @@
           <w:color w:val="000000"/>
           <w:sz w:val="24"/>
         </w:rPr>
+        <w:t xml:space="preserve">三个候选模型对应逐层提出的三个问题。M0检验固定运行状态下是否可用一个稳定的“单位辐照—站级电量”比例概括电站；M1检验比例关系之外是否仍存在稳定的加性偏移，例如计量基线或遗漏的常量效应；M2则进一步检验在相同辐照水平附近，温度升高和风速变化是否还能稳定解释转换效率差异。因此，M1和M2不是为了增加变量而设置，而是分别作为对零截距假设和恒定效率假设的诊断扩展。</w:t>
+      </w:r>
+    </w:p>
+    <w:p>
+      <w:pPr>
+        <w:pStyle w:val="BodyText"/>
+        <w:snapToGrid w:val="0"/>
+        <w:spacing w:line="360" w:lineRule="auto" w:before="0" w:after="0"/>
+        <w:ind w:firstLine="480"/>
+        <w:jc w:val="both"/>
+      </w:pPr>
+      <w:r>
+        <w:rPr>
+          <w:rFonts w:hint="eastAsia" w:ascii="Times New Roman" w:hAnsi="Times New Roman" w:eastAsia="宋体"/>
+          <w:color w:val="000000"/>
+          <w:sz w:val="24"/>
+        </w:rPr>
         <w:t xml:space="preserve">式（7）的符号约束体现有限的物理先验，但不保证温度、风速效应能由15个日样本稳定识别。若扩展模型的系数频繁落在约束边界、接近零或对删除某一天敏感，则其表面拟合改善不能作为采用该模型的理由。</w:t>
       </w:r>
     </w:p>
@@ -6578,6 +6756,23 @@
           <w:sz w:val="24"/>
         </w:rPr>
         <w:t xml:space="preserve">这里加入温度和风速并不等于获得了更多独立信息：15日样本中，温度、风速随天气过程与辐照度共同变化，M2需要估计的是“辐照度相同条件下”的温度和风速边际修正，但数据中用于区分这些效应的独立对照很少。相比之下，辐照度直接决定可利用的太阳能输入，固定的装机规模、方位角和倾角可由一个站级比例系数概括。因此，只有当M2在留出日上稳定降低误差、且修正系数在删去任一日后仍保持物理方向和量级时，额外变量才具有可用的信息增益；否则它们更可能是在分配15日样本中的偶然残差。</w:t>
+      </w:r>
+    </w:p>
+    <w:p>
+      <w:pPr>
+        <w:pStyle w:val="BodyText"/>
+        <w:snapToGrid w:val="0"/>
+        <w:spacing w:line="360" w:lineRule="auto" w:before="0" w:after="0"/>
+        <w:ind w:firstLine="480"/>
+        <w:jc w:val="both"/>
+      </w:pPr>
+      <w:r>
+        <w:rPr>
+          <w:rFonts w:hint="eastAsia" w:ascii="Times New Roman" w:hAnsi="Times New Roman" w:eastAsia="宋体"/>
+          <w:color w:val="000000"/>
+          <w:sz w:val="24"/>
+        </w:rPr>
+        <w:t xml:space="preserve">逐日留一时，每一折实际只有14个训练日。温度、风速与辐照度又不是由实验独立控制，而是同一天气过程的共同结果；若高温日恰好也是高辐照日，模型很难判断输出变化来自太阳能输入增加，还是来自温度对效率的修正。符号约束只能阻止明显违背先验的方向，不能凭空创造这种“同辐照、不同温度或风速”的对照。因此，本题对复杂模型的限制首先是可识别信息不足，而不只是参数个数较多。</w:t>
       </w:r>
     </w:p>
     <w:p>
@@ -8044,6 +8239,51 @@
           <w:sz w:val="24"/>
         </w:rPr>
         <w:t xml:space="preserve">kWh，M1的误差略大但仍落入一标准误集合，因此不需要用截距换取难以区分的微小改善。M2虽然在数值上比M1的MAE略低，但温度项全样本估计接近零、在留一拟合中多次落到零边界，风速项在删去单日后变化超过100%，故不具备稳定的参数解释和预测资格。由此选择M0。这个选择来自误差、资格和简约性共同作用，而不是预先指定M0获胜。</w:t>
+      </w:r>
+    </w:p>
+    <w:p>
+      <w:pPr>
+        <w:pStyle w:val="BodyText"/>
+        <w:snapToGrid w:val="0"/>
+        <w:spacing w:line="360" w:lineRule="auto" w:before="0" w:after="0"/>
+        <w:ind w:firstLine="480"/>
+        <w:jc w:val="both"/>
+      </w:pPr>
+      <w:r>
+        <w:rPr>
+          <w:rFonts w:hint="eastAsia" w:ascii="Times New Roman" w:hAnsi="Times New Roman" w:eastAsia="宋体"/>
+          <w:color w:val="000000"/>
+          <w:sz w:val="24"/>
+        </w:rPr>
+        <w:t xml:space="preserve">在光伏问题中，这一结果应解释为：在当前15日观测范围和未修复运行状态下，辐照度已经解释了可重复用于第16日预测的主要日际变化，数据没有证明截距、温度或风速修正还能提供稳定的样本外信息。它不表示温度和风速在物理上没有作用，而是表示其增量效应在这15个相互相关的天气场景中无法与辐照度效应可靠分离。表中各模型的全样本</w:t>
+      </w:r>
+      <m:oMath>
+        <m:sSup>
+          <m:e>
+            <m:r>
+              <w:rPr>
+                <w:rFonts w:ascii="Cambria Math" w:hAnsi="Cambria Math" w:eastAsia="Cambria Math" w:cs="Cambria Math"/>
+              </w:rPr>
+              <m:t>R</m:t>
+            </m:r>
+          </m:e>
+          <m:sup>
+            <m:r>
+              <w:rPr>
+                <w:rFonts w:ascii="Cambria Math" w:hAnsi="Cambria Math" w:eastAsia="Cambria Math" w:cs="Cambria Math"/>
+              </w:rPr>
+              <m:t>2</m:t>
+            </m:r>
+          </m:sup>
+        </m:sSup>
+      </m:oMath>
+      <w:r>
+        <w:rPr>
+          <w:rFonts w:hint="eastAsia" w:ascii="Times New Roman" w:hAnsi="Times New Roman" w:eastAsia="宋体"/>
+          <w:color w:val="000000"/>
+          <w:sz w:val="24"/>
+        </w:rPr>
+        <w:t xml:space="preserve">几乎相同，也说明仅凭拟合优度无法选择模型；真正起区分作用的是逐日留出误差和系数稳定性。</w:t>
       </w:r>
     </w:p>
     <w:p>
@@ -8500,6 +8740,82 @@
     <w:p>
       <w:pPr>
         <w:pStyle w:val="FirstParagraph"/>
+        <w:snapToGrid w:val="0"/>
+        <w:spacing w:line="360" w:lineRule="auto" w:before="0" w:after="0"/>
+        <w:ind w:firstLine="480"/>
+        <w:jc w:val="both"/>
+      </w:pPr>
+      <m:oMath>
+        <m:sSub>
+          <m:e>
+            <m:acc>
+              <m:accPr>
+                <m:chr m:val="̂"/>
+              </m:accPr>
+              <m:e>
+                <m:r>
+                  <w:rPr>
+                    <w:rFonts w:ascii="Cambria Math" w:hAnsi="Cambria Math" w:eastAsia="Cambria Math" w:cs="Cambria Math"/>
+                  </w:rPr>
+                  <m:t>β</m:t>
+                </m:r>
+              </m:e>
+            </m:acc>
+          </m:e>
+          <m:sub>
+            <m:r>
+              <w:rPr>
+                <w:rFonts w:ascii="Cambria Math" w:hAnsi="Cambria Math" w:eastAsia="Cambria Math" w:cs="Cambria Math"/>
+              </w:rPr>
+              <m:t>H</m:t>
+            </m:r>
+          </m:sub>
+        </m:sSub>
+      </m:oMath>
+      <w:r>
+        <w:rPr>
+          <w:rFonts w:hint="eastAsia" w:ascii="Times New Roman" w:hAnsi="Times New Roman" w:eastAsia="宋体"/>
+          <w:color w:val="000000"/>
+          <w:sz w:val="24"/>
+        </w:rPr>
+        <w:t xml:space="preserve">可理解为当前组件组合、安装条件和故障状态共同形成的站级等效响应系数：在历史观测范围内，总辐照量每增加1</w:t>
+      </w:r>
+      <w:r>
+        <w:rPr>
+          <w:rFonts w:ascii="Times New Roman" w:hAnsi="Times New Roman" w:eastAsia="宋体"/>
+          <w:color w:val="000000"/>
+          <w:sz w:val="24"/>
+        </w:rPr>
+        <w:t xml:space="preserve"> </w:t>
+      </w:r>
+      <w:r>
+        <w:rPr>
+          <w:rFonts w:hint="eastAsia" w:ascii="Times New Roman" w:hAnsi="Times New Roman" w:eastAsia="宋体"/>
+          <w:color w:val="000000"/>
+          <w:sz w:val="24"/>
+        </w:rPr>
+        <w:t xml:space="preserve">kWh/m²，模型对应的全站日发电量增加约51.249</w:t>
+      </w:r>
+      <w:r>
+        <w:rPr>
+          <w:rFonts w:ascii="Times New Roman" w:hAnsi="Times New Roman" w:eastAsia="宋体"/>
+          <w:color w:val="000000"/>
+          <w:sz w:val="24"/>
+        </w:rPr>
+        <w:t xml:space="preserve"> </w:t>
+      </w:r>
+      <w:r>
+        <w:rPr>
+          <w:rFonts w:hint="eastAsia" w:ascii="Times New Roman" w:hAnsi="Times New Roman" w:eastAsia="宋体"/>
+          <w:color w:val="000000"/>
+          <w:sz w:val="24"/>
+        </w:rPr>
+        <w:t xml:space="preserve">kWh。第16日预测是把预报辐照度代入这一已验证的比例关系，而不是把100块组件分别预测后再假设它们具有100组独立天气响应。</w:t>
+      </w:r>
+    </w:p>
+    <w:p>
+      <w:pPr>
+        <w:pStyle w:val="BodyText"/>
         <w:snapToGrid w:val="0"/>
         <w:spacing w:line="360" w:lineRule="auto" w:before="0" w:after="0"/>
         <w:ind w:firstLine="480"/>
@@ -10241,6 +10557,23 @@
           <w:color w:val="000000"/>
           <w:sz w:val="24"/>
         </w:rPr>
+        <w:t xml:space="preserve">式（10）—（12）形成一条直接的运维解释链：先由15日观测得到组件“现在每天发多少”，再用偏差率反演“若处于正常状态每天应发多少”，二者之差才是“修复后每天可能追回多少”。偏差率在其中负责把实际状态连接到正常反事实，但最终排序量必须回到kWh/day，才能与全站增发目标相加和比较。</w:t>
+      </w:r>
+    </w:p>
+    <w:p>
+      <w:pPr>
+        <w:pStyle w:val="BodyText"/>
+        <w:snapToGrid w:val="0"/>
+        <w:spacing w:line="360" w:lineRule="auto" w:before="0" w:after="0"/>
+        <w:ind w:firstLine="480"/>
+        <w:jc w:val="both"/>
+      </w:pPr>
+      <w:r>
+        <w:rPr>
+          <w:rFonts w:hint="eastAsia" w:ascii="Times New Roman" w:hAnsi="Times New Roman" w:eastAsia="宋体"/>
+          <w:color w:val="000000"/>
+          <w:sz w:val="24"/>
+        </w:rPr>
         <w:t xml:space="preserve">当前30块故障组件的偏差率均满足</w:t>
       </w:r>
       <m:oMath>
@@ -14008,6 +14341,23 @@
           <w:sz w:val="21"/>
         </w:rPr>
         <w:t xml:space="preserve">30块故障组件的15日历史平均每日可恢复损失。蓝色为前10名，虚线为维修预算截止位置，误差线表示偏差率显示精度导致的损失端点范围。</w:t>
+      </w:r>
+    </w:p>
+    <w:p>
+      <w:pPr>
+        <w:pStyle w:val="BodyText"/>
+        <w:snapToGrid w:val="0"/>
+        <w:spacing w:line="360" w:lineRule="auto" w:before="0" w:after="0"/>
+        <w:ind w:firstLine="480"/>
+        <w:jc w:val="both"/>
+      </w:pPr>
+      <w:r>
+        <w:rPr>
+          <w:rFonts w:hint="eastAsia" w:ascii="Times New Roman" w:hAnsi="Times New Roman" w:eastAsia="宋体"/>
+          <w:color w:val="000000"/>
+          <w:sz w:val="24"/>
+        </w:rPr>
+        <w:t xml:space="preserve">对运维而言，前10名表示在每次维修占用相同资源且修复能够完全恢复正常反事实时，有限名额应优先投向这些组件，才能使历史平均每日追回电量最大。名单中的10块均为热斑组件，是能量收益口径下计算得到的结果，不意味着隐裂组件无需处理，也不等同于安全风险或故障恶化风险排序；若运维目标改为安全优先、成本效益或停机风险，排序指标也必须随之改变。第10/11名之间仍有明确间隔，则说明当前10块预算下的入选边界不是由偏差率显示舍入偶然决定的。</w:t>
       </w:r>
     </w:p>
     <w:bookmarkEnd w:id="35"/>
@@ -14508,6 +14858,39 @@
           <w:sz w:val="24"/>
         </w:rPr>
         <w:t xml:space="preserve">式（14）—（16）是基于题目定义的正常反事实和可加性假设的历史估计，不是对维修后实际输出的观测，也不包含维修有效率、停机时间、组串耦合或逆变器限发造成的偏差。</w:t>
+      </w:r>
+    </w:p>
+    <w:p>
+      <w:pPr>
+        <w:pStyle w:val="BodyText"/>
+        <w:snapToGrid w:val="0"/>
+        <w:spacing w:line="360" w:lineRule="auto" w:before="0" w:after="0"/>
+        <w:ind w:firstLine="480"/>
+        <w:jc w:val="both"/>
+      </w:pPr>
+      <w:r>
+        <w:rPr>
+          <w:rFonts w:hint="eastAsia" w:ascii="Times New Roman" w:hAnsi="Times New Roman" w:eastAsia="宋体"/>
+          <w:color w:val="000000"/>
+          <w:sz w:val="24"/>
+        </w:rPr>
+        <w:t xml:space="preserve">数值上，5.781</w:t>
+      </w:r>
+      <w:r>
+        <w:rPr>
+          <w:rFonts w:ascii="Times New Roman" w:hAnsi="Times New Roman" w:eastAsia="宋体"/>
+          <w:color w:val="000000"/>
+          <w:sz w:val="24"/>
+        </w:rPr>
+        <w:t xml:space="preserve"> </w:t>
+      </w:r>
+      <w:r>
+        <w:rPr>
+          <w:rFonts w:hint="eastAsia" w:ascii="Times New Roman" w:hAnsi="Times New Roman" w:eastAsia="宋体"/>
+          <w:color w:val="000000"/>
+          <w:sz w:val="24"/>
+        </w:rPr>
+        <w:t xml:space="preserve">kWh/day表示在历史15日天气构成下，若这10块组件均恢复且没有额外停机，电站平均每天可追回的电量；2.969%则以当前未修复状态的全站历史日均发电量为分母，表示同一反事实增量相对于现状的规模。二者分别给出绝对运维收益和相对站级改善，不能把2.969%理解为每块入选组件都提高相同比例。</w:t>
       </w:r>
     </w:p>
     <w:bookmarkEnd w:id="36"/>
@@ -15094,6 +15477,55 @@
           <w:sz w:val="24"/>
         </w:rPr>
         <w:t xml:space="preserve">kWh。这样传播的只是任务二的站级参数不确定性和条件日级残差波动；维修名单、历史损失和比例关系均保持不变，偏差率舍入、正常反事实误差、维修有效率、组串耦合、加性假设、模型选择和第16日气象预报输入误差均未传播到式（17）。</w:t>
+      </w:r>
+    </w:p>
+    <w:p>
+      <w:pPr>
+        <w:pStyle w:val="BodyText"/>
+        <w:snapToGrid w:val="0"/>
+        <w:spacing w:line="360" w:lineRule="auto" w:before="0" w:after="0"/>
+        <w:ind w:firstLine="480"/>
+        <w:jc w:val="both"/>
+      </w:pPr>
+      <w:r>
+        <w:rPr>
+          <w:rFonts w:hint="eastAsia" w:ascii="Times New Roman" w:hAnsi="Times New Roman" w:eastAsia="宋体"/>
+          <w:color w:val="000000"/>
+          <w:sz w:val="24"/>
+        </w:rPr>
+        <w:t xml:space="preserve">由于第16日当前状态的预测发电量高于历史全站日均值，同一维修集合按比例映射后的7.608</w:t>
+      </w:r>
+      <w:r>
+        <w:rPr>
+          <w:rFonts w:ascii="Times New Roman" w:hAnsi="Times New Roman" w:eastAsia="宋体"/>
+          <w:color w:val="000000"/>
+          <w:sz w:val="24"/>
+        </w:rPr>
+        <w:t xml:space="preserve"> </w:t>
+      </w:r>
+      <w:r>
+        <w:rPr>
+          <w:rFonts w:hint="eastAsia" w:ascii="Times New Roman" w:hAnsi="Times New Roman" w:eastAsia="宋体"/>
+          <w:color w:val="000000"/>
+          <w:sz w:val="24"/>
+        </w:rPr>
+        <w:t xml:space="preserve">kWh也高于历史日均收益5.781</w:t>
+      </w:r>
+      <w:r>
+        <w:rPr>
+          <w:rFonts w:ascii="Times New Roman" w:hAnsi="Times New Roman" w:eastAsia="宋体"/>
+          <w:color w:val="000000"/>
+          <w:sz w:val="24"/>
+        </w:rPr>
+        <w:t xml:space="preserve"> </w:t>
+      </w:r>
+      <w:r>
+        <w:rPr>
+          <w:rFonts w:hint="eastAsia" w:ascii="Times New Roman" w:hAnsi="Times New Roman" w:eastAsia="宋体"/>
+          <w:color w:val="000000"/>
+          <w:sz w:val="24"/>
+        </w:rPr>
+        <w:t xml:space="preserve">kWh。这一差别反映的是天气尺度变化，而不是第16日维修更有效；它说明主名单解决“长期历史口径下先修谁”，式（17）解决“既定名单在给定天气日大约补多少”，两者的决策作用不同。</w:t>
       </w:r>
     </w:p>
     <w:bookmarkEnd w:id="37"/>

</xml_diff>